<commit_message>
Update robots verification policy and UI summary cards
</commit_message>
<xml_diff>
--- a/weekly_report.docx
+++ b/weekly_report.docx
@@ -111,7 +111,7 @@
           <w:rFonts w:ascii="FangSong" w:eastAsia="FangSong" w:hAnsi="FangSong" w:hint="eastAsia"/>
           <w:b/>
         </w:rPr>
-        <w:t>中国移动香港公司战略部                                                    2026年5月27日</w:t>
+        <w:t>中国移动香港公司战略部                                                    2026年5月28日</w:t>
       </w:r>
     </w:p>
     <w:p>
@@ -280,6 +280,7 @@
           <w:lang w:eastAsia="zh-CN"/>
         </w:rPr>
         <w:t>2.【监管政策】香港本地监管/政策发布OFCA政策相关政策信息</w:t>
+        <w:br w:type="page"/>
       </w:r>
     </w:p>
     <w:p>
@@ -440,7 +441,7 @@
         <w:rPr>
           <w:lang w:eastAsia="zh-CN"/>
         </w:rPr>
-        <w:t>5.【友商动态】HKT / csl / 1O1O更新战略合作相关信息</w:t>
+        <w:t>5.【友商动态】HGC更新海缆/跨境链路相关信息</w:t>
       </w:r>
     </w:p>
     <w:p>
@@ -455,7 +456,7 @@
         <w:rPr>
           <w:lang w:eastAsia="zh-CN"/>
         </w:rPr>
-        <w:t>6.【友商动态】3HK / Hutchison更新战略合作相关信息</w:t>
+        <w:t>6.【友商动态】iCable更新产品与资费信息</w:t>
       </w:r>
     </w:p>
     <w:p>
@@ -470,7 +471,7 @@
         <w:rPr>
           <w:lang w:eastAsia="zh-CN"/>
         </w:rPr>
-        <w:t>7.【人工智能】SmarTone更新战略合作相关信息</w:t>
+        <w:t>7.【科创政策】行业资讯更新跨境贸易相关信息</w:t>
       </w:r>
     </w:p>
     <w:p>
@@ -485,7 +486,7 @@
         <w:rPr>
           <w:lang w:eastAsia="zh-CN"/>
         </w:rPr>
-        <w:t>8.【友商动态】HKBN更新产品与资费信息</w:t>
+        <w:t>8.【行业资讯】行业资讯更新技术动态相关信息</w:t>
       </w:r>
     </w:p>
     <w:p>
@@ -530,7 +531,7 @@
         <w:rPr>
           <w:lang w:eastAsia="zh-CN"/>
         </w:rPr>
-        <w:t>9.【运营商财报】HKT / csl / 1O1O披露客户数/用户数等经营指标</w:t>
+        <w:t>9.【友商动态】HGC更新家宽用户数相关信息</w:t>
       </w:r>
     </w:p>
     <w:p>
@@ -545,7 +546,7 @@
         <w:rPr>
           <w:lang w:eastAsia="zh-CN"/>
         </w:rPr>
-        <w:t>10.【友商动态】HKT / csl / 1O1O更新产品与资费信息</w:t>
+        <w:t>10.【运营商财报】iCable披露客户数/用户数等经营指标</w:t>
       </w:r>
     </w:p>
     <w:p>
@@ -560,7 +561,7 @@
         <w:rPr>
           <w:lang w:eastAsia="zh-CN"/>
         </w:rPr>
-        <w:t>11.【运营商财报】3HK / Hutchison披露运营收入/总收益等经营指标</w:t>
+        <w:t>11.【宏观经济】香港宏观经济资讯更新人口相关宏观数据</w:t>
       </w:r>
     </w:p>
     <w:p>
@@ -575,7 +576,7 @@
         <w:rPr>
           <w:lang w:eastAsia="zh-CN"/>
         </w:rPr>
-        <w:t>12.【友商动态】3HK / Hutchison更新产品与资费信息</w:t>
+        <w:t>12.【社会民生】社会资讯更新本地生活咨询相关信息</w:t>
       </w:r>
     </w:p>
     <w:p>
@@ -1055,7 +1056,7 @@
           <w:sz w:val="28"/>
           <w:u w:val="single"/>
         </w:rPr>
-        <w:t>五、HKT / csl / 1O1O更新战略合作相关信息</w:t>
+        <w:t>五、HGC更新海缆/跨境链路相关信息</w:t>
       </w:r>
     </w:p>
     <w:p>
@@ -1073,7 +1074,7 @@
           <w:color w:val="000000" w:themeColor="text1"/>
           <w:sz w:val="28"/>
         </w:rPr>
-        <w:t>HKT / csl / 1O1O在友商动态领域形成公开信息更新，本轮成功来源3个，可复核字段覆盖战略合作、中标、5G-A、网络API、边缘计算、数据中心；待补充字段包括投资并购。</w:t>
+        <w:t>HGC在友商动态领域形成公开信息更新，本轮成功来源2个，可复核字段覆盖海缆/跨境链路、数据中心、企业网络、合作项目。</w:t>
       </w:r>
     </w:p>
     <w:p>
@@ -1125,7 +1126,7 @@
           <w:sz w:val="28"/>
           <w:u w:val="single"/>
         </w:rPr>
-        <w:t>六、3HK / Hutchison更新战略合作相关信息</w:t>
+        <w:t>六、iCable更新产品与资费信息</w:t>
       </w:r>
     </w:p>
     <w:p>
@@ -1143,7 +1144,7 @@
           <w:color w:val="000000" w:themeColor="text1"/>
           <w:sz w:val="28"/>
         </w:rPr>
-        <w:t>3HK / Hutchison在友商动态领域形成公开信息更新，本轮成功来源2个，可复核字段覆盖战略合作、中标、5G-A、企业ICT、IoT、区域动作。</w:t>
+        <w:t>iCable在友商动态领域形成公开信息更新，本轮成功来源3个，可复核字段覆盖宽带套餐、电讯业务战略合作。</w:t>
       </w:r>
     </w:p>
     <w:p>
@@ -1173,7 +1174,7 @@
           <w:color w:val="A6A6A6" w:themeColor="background1" w:themeShade="A6"/>
           <w:sz w:val="28"/>
         </w:rPr>
-        <w:t>人工智能</w:t>
+        <w:t>科创政策</w:t>
       </w:r>
     </w:p>
     <w:p>
@@ -1195,7 +1196,7 @@
           <w:sz w:val="28"/>
           <w:u w:val="single"/>
         </w:rPr>
-        <w:t>七、SmarTone更新战略合作相关信息</w:t>
+        <w:t>七、行业资讯更新跨境贸易相关信息</w:t>
       </w:r>
     </w:p>
     <w:p>
@@ -1213,7 +1214,7 @@
           <w:color w:val="000000" w:themeColor="text1"/>
           <w:sz w:val="28"/>
         </w:rPr>
-        <w:t>SmarTone在人工智能领域形成公开信息更新，本轮成功来源2个，可复核字段覆盖战略合作、中标、5G-A、家宽布局、区域动作。</w:t>
+        <w:t>行业资讯在科创政策领域形成公开信息更新，本轮成功来源4个，可复核字段覆盖跨境贸易、科技创投、人工智能、低空经济、Web3。</w:t>
       </w:r>
     </w:p>
     <w:p>
@@ -1243,7 +1244,7 @@
           <w:color w:val="A6A6A6" w:themeColor="background1" w:themeShade="A6"/>
           <w:sz w:val="28"/>
         </w:rPr>
-        <w:t>友商动态</w:t>
+        <w:t>行业资讯</w:t>
       </w:r>
     </w:p>
     <w:bookmarkEnd w:id="4"/>
@@ -1269,7 +1270,7 @@
           <w:sz w:val="28"/>
           <w:u w:val="single"/>
         </w:rPr>
-        <w:t>八、HKBN更新产品与资费信息</w:t>
+        <w:t>八、行业资讯更新技术动态相关信息</w:t>
       </w:r>
     </w:p>
     <w:p>
@@ -1287,7 +1288,7 @@
           <w:color w:val="000000" w:themeColor="text1"/>
           <w:sz w:val="28"/>
         </w:rPr>
-        <w:t>HKBN在友商动态领域形成公开信息更新，本轮成功来源3个，可复核字段覆盖宽带套餐、企业ICT、云/安全、融合产品、重大合作、区域布局。</w:t>
+        <w:t>行业资讯在行业资讯领域形成公开信息更新，本轮成功来源2个，可复核字段覆盖技术动态、企业重大合作、前沿产品；待补充字段包括市场趋势。</w:t>
       </w:r>
     </w:p>
     <w:p>
@@ -1341,6 +1342,76 @@
           <w:color w:val="A6A6A6" w:themeColor="background1" w:themeShade="A6"/>
           <w:sz w:val="28"/>
         </w:rPr>
+        <w:t>友商动态</w:t>
+      </w:r>
+    </w:p>
+    <w:p>
+      <w:pPr>
+        <w:widowControl/>
+        <w:rPr>
+          <w:rFonts w:ascii="FangSong" w:eastAsia="FangSong" w:hAnsi="FangSong"/>
+          <w:b/>
+          <w:color w:val="000000" w:themeColor="text1"/>
+          <w:sz w:val="28"/>
+          <w:u w:val="single"/>
+        </w:rPr>
+      </w:pPr>
+      <w:r>
+        <w:rPr>
+          <w:rFonts w:ascii="FangSong" w:eastAsia="FangSong" w:hAnsi="FangSong" w:hint="eastAsia"/>
+          <w:b/>
+          <w:color w:val="000000" w:themeColor="text1"/>
+          <w:sz w:val="28"/>
+          <w:u w:val="single"/>
+        </w:rPr>
+        <w:t>九、HGC更新家宽用户数相关信息</w:t>
+      </w:r>
+    </w:p>
+    <w:p>
+      <w:pPr>
+        <w:widowControl/>
+        <w:rPr>
+          <w:rFonts w:ascii="FangSong" w:eastAsia="FangSong" w:hAnsi="FangSong"/>
+          <w:color w:val="000000" w:themeColor="text1"/>
+          <w:sz w:val="28"/>
+        </w:rPr>
+      </w:pPr>
+      <w:r>
+        <w:rPr>
+          <w:rFonts w:ascii="FangSong" w:eastAsia="FangSong" w:hAnsi="FangSong" w:hint="eastAsia"/>
+          <w:color w:val="000000" w:themeColor="text1"/>
+          <w:sz w:val="28"/>
+        </w:rPr>
+        <w:t>HGC在友商动态领域形成公开信息更新，本轮成功来源2个，可复核字段覆盖家宽用户数、网络覆盖、企业通信、跨境链路、数据中心、云网产品。</w:t>
+      </w:r>
+    </w:p>
+    <w:p>
+      <w:pPr>
+        <w:widowControl/>
+        <w:rPr>
+          <w:rFonts w:ascii="FangSong" w:eastAsia="FangSong" w:hAnsi="FangSong"/>
+          <w:color w:val="000000" w:themeColor="text1"/>
+          <w:sz w:val="28"/>
+        </w:rPr>
+      </w:pPr>
+    </w:p>
+    <w:p>
+      <w:pPr>
+        <w:widowControl/>
+        <w:rPr>
+          <w:rFonts w:ascii="FangSong" w:eastAsia="FangSong" w:hAnsi="FangSong"/>
+          <w:b/>
+          <w:color w:val="A6A6A6" w:themeColor="background1" w:themeShade="A6"/>
+          <w:sz w:val="28"/>
+        </w:rPr>
+      </w:pPr>
+      <w:r>
+        <w:rPr>
+          <w:rFonts w:ascii="FangSong" w:eastAsia="FangSong" w:hAnsi="FangSong" w:hint="eastAsia"/>
+          <w:b/>
+          <w:color w:val="A6A6A6" w:themeColor="background1" w:themeShade="A6"/>
+          <w:sz w:val="28"/>
+        </w:rPr>
         <w:t>运营商财报</w:t>
       </w:r>
     </w:p>
@@ -1363,9 +1434,10 @@
           <w:sz w:val="28"/>
           <w:u w:val="single"/>
         </w:rPr>
-        <w:t>九、HKT / csl / 1O1O披露客户数/用户数等经营指标</w:t>
-      </w:r>
-    </w:p>
+        <w:t>十、iCable披露客户数/用户数等经营指标</w:t>
+      </w:r>
+    </w:p>
+    <w:bookmarkEnd w:id="8"/>
     <w:p>
       <w:pPr>
         <w:widowControl/>
@@ -1381,7 +1453,7 @@
           <w:color w:val="000000" w:themeColor="text1"/>
           <w:sz w:val="28"/>
         </w:rPr>
-        <w:t>HKT / csl / 1O1O在运营商财报领域形成公开信息更新，本轮成功来源2个，可复核字段覆盖客户数/用户数、5G用户数、宽频线数/家宽用户数；待补充字段包括运营收入/总收益、服务收入、EBITDA。</w:t>
+        <w:t>iCable在运营商财报领域形成公开信息更新，本轮成功来源3个，可复核字段覆盖客户数/用户数；待补充字段包括运营收入/总收益、服务收入、EBITDA。</w:t>
       </w:r>
     </w:p>
     <w:p>
@@ -1411,7 +1483,7 @@
           <w:color w:val="A6A6A6" w:themeColor="background1" w:themeShade="A6"/>
           <w:sz w:val="28"/>
         </w:rPr>
-        <w:t>友商动态</w:t>
+        <w:t>宏观经济</w:t>
       </w:r>
     </w:p>
     <w:p>
@@ -1433,10 +1505,9 @@
           <w:sz w:val="28"/>
           <w:u w:val="single"/>
         </w:rPr>
-        <w:t>十、HKT / csl / 1O1O更新产品与资费信息</w:t>
-      </w:r>
-    </w:p>
-    <w:bookmarkEnd w:id="8"/>
+        <w:t>十一、香港宏观经济资讯更新人口相关宏观数据</w:t>
+      </w:r>
+    </w:p>
     <w:p>
       <w:pPr>
         <w:widowControl/>
@@ -1452,7 +1523,7 @@
           <w:color w:val="000000" w:themeColor="text1"/>
           <w:sz w:val="28"/>
         </w:rPr>
-        <w:t>HKT / csl / 1O1O在友商动态领域形成公开信息更新，本轮成功来源3个，可复核字段覆盖5G套餐、产品规格、合约期、资费、增值服务、家宽套餐。</w:t>
+        <w:t>香港宏观经济资讯在宏观经济领域形成公开信息更新，本轮成功来源4个，可复核字段覆盖人口、零售额、失业率；待补充字段包括PMI。</w:t>
       </w:r>
     </w:p>
     <w:p>
@@ -1482,7 +1553,7 @@
           <w:color w:val="A6A6A6" w:themeColor="background1" w:themeShade="A6"/>
           <w:sz w:val="28"/>
         </w:rPr>
-        <w:t>运营商财报</w:t>
+        <w:t>社会民生</w:t>
       </w:r>
     </w:p>
     <w:p>
@@ -1504,7 +1575,7 @@
           <w:sz w:val="28"/>
           <w:u w:val="single"/>
         </w:rPr>
-        <w:t>十一、3HK / Hutchison披露运营收入/总收益等经营指标</w:t>
+        <w:t>十二、社会资讯更新本地生活咨询相关信息</w:t>
       </w:r>
     </w:p>
     <w:p>
@@ -1522,77 +1593,7 @@
           <w:color w:val="000000" w:themeColor="text1"/>
           <w:sz w:val="28"/>
         </w:rPr>
-        <w:t>3HK / Hutchison在运营商财报领域形成公开信息更新，本轮成功来源3个，可复核字段覆盖运营收入/总收益、服务收入、EBITDA、净利润、客户数/用户数、5G用户数。</w:t>
-      </w:r>
-    </w:p>
-    <w:p>
-      <w:pPr>
-        <w:widowControl/>
-        <w:rPr>
-          <w:rFonts w:ascii="FangSong" w:eastAsia="FangSong" w:hAnsi="FangSong"/>
-          <w:color w:val="000000" w:themeColor="text1"/>
-          <w:sz w:val="28"/>
-        </w:rPr>
-      </w:pPr>
-    </w:p>
-    <w:p>
-      <w:pPr>
-        <w:widowControl/>
-        <w:rPr>
-          <w:rFonts w:ascii="FangSong" w:eastAsia="FangSong" w:hAnsi="FangSong"/>
-          <w:b/>
-          <w:color w:val="A6A6A6" w:themeColor="background1" w:themeShade="A6"/>
-          <w:sz w:val="28"/>
-        </w:rPr>
-      </w:pPr>
-      <w:r>
-        <w:rPr>
-          <w:rFonts w:ascii="FangSong" w:eastAsia="FangSong" w:hAnsi="FangSong" w:hint="eastAsia"/>
-          <w:b/>
-          <w:color w:val="A6A6A6" w:themeColor="background1" w:themeShade="A6"/>
-          <w:sz w:val="28"/>
-        </w:rPr>
-        <w:t>友商动态</w:t>
-      </w:r>
-    </w:p>
-    <w:p>
-      <w:pPr>
-        <w:widowControl/>
-        <w:rPr>
-          <w:rFonts w:ascii="FangSong" w:eastAsia="FangSong" w:hAnsi="FangSong"/>
-          <w:b/>
-          <w:color w:val="000000" w:themeColor="text1"/>
-          <w:sz w:val="28"/>
-          <w:u w:val="single"/>
-        </w:rPr>
-      </w:pPr>
-      <w:r>
-        <w:rPr>
-          <w:rFonts w:ascii="FangSong" w:eastAsia="FangSong" w:hAnsi="FangSong" w:hint="eastAsia"/>
-          <w:b/>
-          <w:color w:val="000000" w:themeColor="text1"/>
-          <w:sz w:val="28"/>
-          <w:u w:val="single"/>
-        </w:rPr>
-        <w:t>十二、3HK / Hutchison更新产品与资费信息</w:t>
-      </w:r>
-    </w:p>
-    <w:p>
-      <w:pPr>
-        <w:widowControl/>
-        <w:rPr>
-          <w:rFonts w:ascii="FangSong" w:eastAsia="FangSong" w:hAnsi="FangSong"/>
-          <w:color w:val="000000" w:themeColor="text1"/>
-          <w:sz w:val="28"/>
-        </w:rPr>
-      </w:pPr>
-      <w:r>
-        <w:rPr>
-          <w:rFonts w:ascii="FangSong" w:eastAsia="FangSong" w:hAnsi="FangSong" w:hint="eastAsia"/>
-          <w:color w:val="000000" w:themeColor="text1"/>
-          <w:sz w:val="28"/>
-        </w:rPr>
-        <w:t>3HK / Hutchison在友商动态领域形成公开信息更新，本轮成功来源2个，可复核字段覆盖5G套餐、SoSIM/Mo+、企业方案、漫游、促销折扣。</w:t>
+        <w:t>社会资讯在社会民生领域形成公开信息更新，本轮成功来源2个，可复核字段覆盖本地生活咨询。</w:t>
       </w:r>
     </w:p>
     <w:p>
@@ -1896,7 +1897,7 @@
           <w:color w:val="000000" w:themeColor="text1"/>
           <w:sz w:val="28"/>
         </w:rPr>
-        <w:t>国际组织/行业权威机构在国际组织领域形成公开信息更新，本轮成功来源3个，可复核字段覆盖ITU数字发展、宽带指标、OECD数字经济、World Bank/IMF宏观。</w:t>
+        <w:t>国际组织/行业权威机构在国际组织领域形成公开信息更新，本轮成功来源4个，可复核字段覆盖ITU数字发展、宽带指标、OECD数字经济、World Bank/IMF宏观。</w:t>
       </w:r>
     </w:p>
     <w:p>

</xml_diff>